<commit_message>
update README, dependencies, and gitignore
- Rewrote README with accurate description, repository structure table, and corrected installation instructions
- Updated require.txt and setup.py to match environment.yml (numpy 2.3.0, torch 2.8.0, matplotlib 3.10.8, added openai, openai-agents, agapi, gsd)
- Added .gitignore excluding build/, __pycache__/, and LLM Examples/Run LLM with API Key.ipynb
- Deleted stale build/ artifact directory

Co-Authored-By: Claude Sonnet 4.6 <noreply@anthropic.com>
</commit_message>
<xml_diff>
--- a/Data/ferritin/Summary.docx
+++ b/Data/ferritin/Summary.docx
@@ -11,10 +11,10 @@
           <w:noProof/>
         </w:rPr>
         <w:drawing>
-          <wp:inline distT="0" distB="0" distL="0" distR="0" wp14:anchorId="22947A06" wp14:editId="6D11FA01">
-            <wp:extent cx="3943350" cy="3696891"/>
-            <wp:effectExtent l="0" t="0" r="0" b="0"/>
-            <wp:docPr id="687647386" name="Picture 2"/>
+          <wp:inline distT="0" distB="0" distL="0" distR="0" wp14:anchorId="618DC9F1" wp14:editId="5197B001">
+            <wp:extent cx="3269244" cy="3067296"/>
+            <wp:effectExtent l="0" t="0" r="7620" b="0"/>
+            <wp:docPr id="1304712074" name="Picture 1"/>
             <wp:cNvGraphicFramePr>
               <a:graphicFrameLocks xmlns:a="http://schemas.openxmlformats.org/drawingml/2006/main" noChangeAspect="1"/>
             </wp:cNvGraphicFramePr>
@@ -22,7 +22,7 @@
               <a:graphicData uri="http://schemas.openxmlformats.org/drawingml/2006/picture">
                 <pic:pic xmlns:pic="http://schemas.openxmlformats.org/drawingml/2006/picture">
                   <pic:nvPicPr>
-                    <pic:cNvPr id="0" name="Picture 2"/>
+                    <pic:cNvPr id="0" name="Picture 1"/>
                     <pic:cNvPicPr>
                       <a:picLocks noChangeAspect="1" noChangeArrowheads="1"/>
                     </pic:cNvPicPr>
@@ -43,7 +43,7 @@
                   <pic:spPr bwMode="auto">
                     <a:xfrm>
                       <a:off x="0" y="0"/>
-                      <a:ext cx="3948608" cy="3701821"/>
+                      <a:ext cx="3284374" cy="3081492"/>
                     </a:xfrm>
                     <a:prstGeom prst="rect">
                       <a:avLst/>
@@ -199,7 +199,13 @@
           <w:rPr>
             <w:rFonts w:ascii="Cambria Math" w:hAnsi="Cambria Math"/>
           </w:rPr>
-          <m:t>2×</m:t>
+          <m:t>3.28</m:t>
+        </m:r>
+        <m:r>
+          <w:rPr>
+            <w:rFonts w:ascii="Cambria Math" w:hAnsi="Cambria Math"/>
+          </w:rPr>
+          <m:t>×</m:t>
         </m:r>
         <m:sSup>
           <m:sSupPr>
@@ -490,7 +496,27 @@
         <w:rPr>
           <w:rFonts w:eastAsiaTheme="minorEastAsia"/>
         </w:rPr>
-        <w:t xml:space="preserve">, showing good agreement. </w:t>
+        <w:t>, showing good agreement.</w:t>
+      </w:r>
+      <w:r>
+        <w:rPr>
+          <w:rFonts w:eastAsiaTheme="minorEastAsia"/>
+        </w:rPr>
+        <w:t xml:space="preserve"> While there is some disagreement at </w:t>
+      </w:r>
+      <w:proofErr w:type="gramStart"/>
+      <w:r>
+        <w:rPr>
+          <w:rFonts w:eastAsiaTheme="minorEastAsia"/>
+        </w:rPr>
+        <w:t>high-q</w:t>
+      </w:r>
+      <w:proofErr w:type="gramEnd"/>
+      <w:r>
+        <w:rPr>
+          <w:rFonts w:eastAsiaTheme="minorEastAsia"/>
+        </w:rPr>
+        <w:t xml:space="preserve">, an explanation could be that the experimental data is noisy in that region, seen in the high uncertainty values. In addition, the high-q region is very sensitive to buffer subtraction, where high improper subtraction can lead to deviations in the data. </w:t>
       </w:r>
     </w:p>
     <w:p>
@@ -521,10 +547,10 @@
         </w:rPr>
         <w:lastRenderedPageBreak/>
         <w:drawing>
-          <wp:inline distT="0" distB="0" distL="0" distR="0" wp14:anchorId="0CAF01C9" wp14:editId="3CD8C917">
-            <wp:extent cx="3869741" cy="3631450"/>
-            <wp:effectExtent l="0" t="0" r="0" b="7620"/>
-            <wp:docPr id="1270436100" name="Picture 1"/>
+          <wp:inline distT="0" distB="0" distL="0" distR="0" wp14:anchorId="35A8724E" wp14:editId="74FE0F23">
+            <wp:extent cx="2825378" cy="2672590"/>
+            <wp:effectExtent l="0" t="0" r="0" b="0"/>
+            <wp:docPr id="452332032" name="Picture 3"/>
             <wp:cNvGraphicFramePr>
               <a:graphicFrameLocks xmlns:a="http://schemas.openxmlformats.org/drawingml/2006/main" noChangeAspect="1"/>
             </wp:cNvGraphicFramePr>
@@ -532,7 +558,7 @@
               <a:graphicData uri="http://schemas.openxmlformats.org/drawingml/2006/picture">
                 <pic:pic xmlns:pic="http://schemas.openxmlformats.org/drawingml/2006/picture">
                   <pic:nvPicPr>
-                    <pic:cNvPr id="0" name="Picture 1"/>
+                    <pic:cNvPr id="0" name="Picture 3"/>
                     <pic:cNvPicPr>
                       <a:picLocks noChangeAspect="1" noChangeArrowheads="1"/>
                     </pic:cNvPicPr>
@@ -553,7 +579,7 @@
                   <pic:spPr bwMode="auto">
                     <a:xfrm>
                       <a:off x="0" y="0"/>
-                      <a:ext cx="3877491" cy="3638723"/>
+                      <a:ext cx="2832038" cy="2678890"/>
                     </a:xfrm>
                     <a:prstGeom prst="rect">
                       <a:avLst/>
@@ -637,6 +663,11 @@
       </w:r>
     </w:p>
     <w:p>
+      <w:pPr>
+        <w:rPr>
+          <w:rFonts w:eastAsiaTheme="minorEastAsia"/>
+        </w:rPr>
+      </w:pPr>
       <w:r>
         <w:t>To fit t</w:t>
       </w:r>
@@ -736,10 +767,16 @@
         <w:t>ferritin separation distance of 1</w:t>
       </w:r>
       <w:r>
-        <w:t>6</w:t>
-      </w:r>
-      <w:r>
-        <w:t xml:space="preserve">.5 </w:t>
+        <w:t>7</w:t>
+      </w:r>
+      <w:r>
+        <w:t>.</w:t>
+      </w:r>
+      <w:r>
+        <w:t>0</w:t>
+      </w:r>
+      <w:r>
+        <w:t xml:space="preserve"> </w:t>
       </w:r>
       <w:r>
         <w:t>nm</w:t>
@@ -748,13 +785,19 @@
         <w:t>,</w:t>
       </w:r>
       <w:r>
-        <w:t xml:space="preserve"> a dimer proportion of 36%,</w:t>
+        <w:t xml:space="preserve"> a dimer proportion of </w:t>
+      </w:r>
+      <w:r>
+        <w:t>22</w:t>
+      </w:r>
+      <w:r>
+        <w:t>%,</w:t>
       </w:r>
       <w:r>
         <w:t xml:space="preserve"> a background of 0.0</w:t>
       </w:r>
       <w:r>
-        <w:t>31</w:t>
+        <w:t>40</w:t>
       </w:r>
       <w:r>
         <w:t xml:space="preserve"> and a scale parameter of </w:t>
@@ -764,7 +807,13 @@
           <w:rPr>
             <w:rFonts w:ascii="Cambria Math" w:hAnsi="Cambria Math"/>
           </w:rPr>
-          <m:t>3.3×</m:t>
+          <m:t>7</m:t>
+        </m:r>
+        <m:r>
+          <w:rPr>
+            <w:rFonts w:ascii="Cambria Math" w:hAnsi="Cambria Math"/>
+          </w:rPr>
+          <m:t>.3×</m:t>
         </m:r>
         <m:sSup>
           <m:sSupPr>
@@ -788,7 +837,13 @@
               <w:rPr>
                 <w:rFonts w:ascii="Cambria Math" w:hAnsi="Cambria Math"/>
               </w:rPr>
-              <m:t>-6</m:t>
+              <m:t>-</m:t>
+            </m:r>
+            <m:r>
+              <w:rPr>
+                <w:rFonts w:ascii="Cambria Math" w:hAnsi="Cambria Math"/>
+              </w:rPr>
+              <m:t>4</m:t>
             </m:r>
           </m:sup>
         </m:sSup>
@@ -807,6 +862,243 @@
         </w:rPr>
         <w:t xml:space="preserve">Figure 2. </w:t>
       </w:r>
+      <w:r>
+        <w:rPr>
+          <w:rFonts w:eastAsiaTheme="minorEastAsia"/>
+        </w:rPr>
+        <w:t xml:space="preserve">The following equation shows the scattering curve that was fitted: </w:t>
+      </w:r>
+    </w:p>
+    <w:p>
+      <w:pPr>
+        <w:rPr>
+          <w:rFonts w:eastAsiaTheme="minorEastAsia"/>
+        </w:rPr>
+      </w:pPr>
+      <m:oMathPara>
+        <m:oMath>
+          <m:r>
+            <w:rPr>
+              <w:rFonts w:ascii="Cambria Math" w:hAnsi="Cambria Math"/>
+            </w:rPr>
+            <m:t>I</m:t>
+          </m:r>
+          <m:sSub>
+            <m:sSubPr>
+              <m:ctrlPr>
+                <w:rPr>
+                  <w:rFonts w:ascii="Cambria Math" w:hAnsi="Cambria Math"/>
+                  <w:i/>
+                </w:rPr>
+              </m:ctrlPr>
+            </m:sSubPr>
+            <m:e>
+              <m:d>
+                <m:dPr>
+                  <m:ctrlPr>
+                    <w:rPr>
+                      <w:rFonts w:ascii="Cambria Math" w:hAnsi="Cambria Math"/>
+                      <w:i/>
+                    </w:rPr>
+                  </m:ctrlPr>
+                </m:dPr>
+                <m:e>
+                  <m:r>
+                    <w:rPr>
+                      <w:rFonts w:ascii="Cambria Math" w:hAnsi="Cambria Math"/>
+                    </w:rPr>
+                    <m:t>q</m:t>
+                  </m:r>
+                </m:e>
+              </m:d>
+            </m:e>
+            <m:sub>
+              <m:r>
+                <w:rPr>
+                  <w:rFonts w:ascii="Cambria Math" w:hAnsi="Cambria Math"/>
+                </w:rPr>
+                <m:t>total</m:t>
+              </m:r>
+            </m:sub>
+          </m:sSub>
+          <m:r>
+            <w:rPr>
+              <w:rFonts w:ascii="Cambria Math" w:hAnsi="Cambria Math"/>
+            </w:rPr>
+            <m:t>=scale(I</m:t>
+          </m:r>
+          <m:sSub>
+            <m:sSubPr>
+              <m:ctrlPr>
+                <w:rPr>
+                  <w:rFonts w:ascii="Cambria Math" w:hAnsi="Cambria Math"/>
+                  <w:i/>
+                </w:rPr>
+              </m:ctrlPr>
+            </m:sSubPr>
+            <m:e>
+              <m:d>
+                <m:dPr>
+                  <m:ctrlPr>
+                    <w:rPr>
+                      <w:rFonts w:ascii="Cambria Math" w:hAnsi="Cambria Math"/>
+                      <w:i/>
+                    </w:rPr>
+                  </m:ctrlPr>
+                </m:dPr>
+                <m:e>
+                  <m:r>
+                    <w:rPr>
+                      <w:rFonts w:ascii="Cambria Math" w:hAnsi="Cambria Math"/>
+                    </w:rPr>
+                    <m:t>q</m:t>
+                  </m:r>
+                </m:e>
+              </m:d>
+            </m:e>
+            <m:sub>
+              <m:r>
+                <w:rPr>
+                  <w:rFonts w:ascii="Cambria Math" w:hAnsi="Cambria Math"/>
+                </w:rPr>
+                <m:t>monomer</m:t>
+              </m:r>
+            </m:sub>
+          </m:sSub>
+          <m:d>
+            <m:dPr>
+              <m:ctrlPr>
+                <w:rPr>
+                  <w:rFonts w:ascii="Cambria Math" w:hAnsi="Cambria Math"/>
+                  <w:i/>
+                </w:rPr>
+              </m:ctrlPr>
+            </m:dPr>
+            <m:e>
+              <m:r>
+                <w:rPr>
+                  <w:rFonts w:ascii="Cambria Math" w:hAnsi="Cambria Math"/>
+                </w:rPr>
+                <m:t xml:space="preserve">1- </m:t>
+              </m:r>
+              <m:sSub>
+                <m:sSubPr>
+                  <m:ctrlPr>
+                    <w:rPr>
+                      <w:rFonts w:ascii="Cambria Math" w:hAnsi="Cambria Math"/>
+                      <w:i/>
+                    </w:rPr>
+                  </m:ctrlPr>
+                </m:sSubPr>
+                <m:e>
+                  <m:r>
+                    <w:rPr>
+                      <w:rFonts w:ascii="Cambria Math" w:hAnsi="Cambria Math"/>
+                    </w:rPr>
+                    <m:t>P</m:t>
+                  </m:r>
+                </m:e>
+                <m:sub>
+                  <m:r>
+                    <w:rPr>
+                      <w:rFonts w:ascii="Cambria Math" w:hAnsi="Cambria Math"/>
+                    </w:rPr>
+                    <m:t>dimer</m:t>
+                  </m:r>
+                </m:sub>
+              </m:sSub>
+            </m:e>
+          </m:d>
+          <m:r>
+            <w:rPr>
+              <w:rFonts w:ascii="Cambria Math" w:hAnsi="Cambria Math"/>
+            </w:rPr>
+            <m:t>+I</m:t>
+          </m:r>
+          <m:sSub>
+            <m:sSubPr>
+              <m:ctrlPr>
+                <w:rPr>
+                  <w:rFonts w:ascii="Cambria Math" w:hAnsi="Cambria Math"/>
+                  <w:i/>
+                </w:rPr>
+              </m:ctrlPr>
+            </m:sSubPr>
+            <m:e>
+              <m:d>
+                <m:dPr>
+                  <m:ctrlPr>
+                    <w:rPr>
+                      <w:rFonts w:ascii="Cambria Math" w:hAnsi="Cambria Math"/>
+                      <w:i/>
+                    </w:rPr>
+                  </m:ctrlPr>
+                </m:dPr>
+                <m:e>
+                  <m:r>
+                    <w:rPr>
+                      <w:rFonts w:ascii="Cambria Math" w:hAnsi="Cambria Math"/>
+                    </w:rPr>
+                    <m:t>q</m:t>
+                  </m:r>
+                </m:e>
+              </m:d>
+            </m:e>
+            <m:sub>
+              <m:r>
+                <w:rPr>
+                  <w:rFonts w:ascii="Cambria Math" w:hAnsi="Cambria Math"/>
+                </w:rPr>
+                <m:t>dimer</m:t>
+              </m:r>
+            </m:sub>
+          </m:sSub>
+          <m:d>
+            <m:dPr>
+              <m:ctrlPr>
+                <w:rPr>
+                  <w:rFonts w:ascii="Cambria Math" w:hAnsi="Cambria Math"/>
+                  <w:i/>
+                </w:rPr>
+              </m:ctrlPr>
+            </m:dPr>
+            <m:e>
+              <m:sSub>
+                <m:sSubPr>
+                  <m:ctrlPr>
+                    <w:rPr>
+                      <w:rFonts w:ascii="Cambria Math" w:hAnsi="Cambria Math"/>
+                      <w:i/>
+                    </w:rPr>
+                  </m:ctrlPr>
+                </m:sSubPr>
+                <m:e>
+                  <m:r>
+                    <w:rPr>
+                      <w:rFonts w:ascii="Cambria Math" w:hAnsi="Cambria Math"/>
+                    </w:rPr>
+                    <m:t>P</m:t>
+                  </m:r>
+                </m:e>
+                <m:sub>
+                  <m:r>
+                    <w:rPr>
+                      <w:rFonts w:ascii="Cambria Math" w:hAnsi="Cambria Math"/>
+                    </w:rPr>
+                    <m:t>dimer</m:t>
+                  </m:r>
+                </m:sub>
+              </m:sSub>
+            </m:e>
+          </m:d>
+          <m:r>
+            <w:rPr>
+              <w:rFonts w:ascii="Cambria Math" w:hAnsi="Cambria Math"/>
+            </w:rPr>
+            <m:t>)+background</m:t>
+          </m:r>
+        </m:oMath>
+      </m:oMathPara>
     </w:p>
     <w:p>
       <w:pPr>
@@ -824,10 +1116,11 @@
           <w:rFonts w:eastAsiaTheme="minorEastAsia"/>
           <w:noProof/>
         </w:rPr>
+        <w:lastRenderedPageBreak/>
         <w:drawing>
-          <wp:inline distT="0" distB="0" distL="0" distR="0" wp14:anchorId="49E728E6" wp14:editId="5F2CAA65">
-            <wp:extent cx="4591050" cy="4304109"/>
-            <wp:effectExtent l="0" t="0" r="0" b="1270"/>
+          <wp:inline distT="0" distB="0" distL="0" distR="0" wp14:anchorId="49E728E6" wp14:editId="16B691A4">
+            <wp:extent cx="2831463" cy="2654496"/>
+            <wp:effectExtent l="0" t="0" r="7620" b="0"/>
             <wp:docPr id="1995272105" name="Picture 3"/>
             <wp:cNvGraphicFramePr>
               <a:graphicFrameLocks xmlns:a="http://schemas.openxmlformats.org/drawingml/2006/main" noChangeAspect="1"/>
@@ -857,7 +1150,7 @@
                   <pic:spPr bwMode="auto">
                     <a:xfrm>
                       <a:off x="0" y="0"/>
-                      <a:ext cx="4595053" cy="4307862"/>
+                      <a:ext cx="2841768" cy="2664157"/>
                     </a:xfrm>
                     <a:prstGeom prst="rect">
                       <a:avLst/>
@@ -1040,6 +1333,89 @@
           <w:rFonts w:eastAsiaTheme="minorEastAsia"/>
         </w:rPr>
       </w:pPr>
+    </w:p>
+    <w:p>
+      <w:pPr>
+        <w:rPr>
+          <w:rFonts w:eastAsiaTheme="minorEastAsia"/>
+        </w:rPr>
+      </w:pPr>
+    </w:p>
+    <w:p>
+      <w:pPr>
+        <w:rPr>
+          <w:rFonts w:eastAsiaTheme="minorEastAsia"/>
+        </w:rPr>
+      </w:pPr>
+    </w:p>
+    <w:p>
+      <w:pPr>
+        <w:rPr>
+          <w:rFonts w:eastAsiaTheme="minorEastAsia"/>
+        </w:rPr>
+      </w:pPr>
+    </w:p>
+    <w:p>
+      <w:pPr>
+        <w:rPr>
+          <w:rFonts w:eastAsiaTheme="minorEastAsia"/>
+        </w:rPr>
+      </w:pPr>
+    </w:p>
+    <w:p>
+      <w:pPr>
+        <w:rPr>
+          <w:rFonts w:eastAsiaTheme="minorEastAsia"/>
+        </w:rPr>
+      </w:pPr>
+    </w:p>
+    <w:p>
+      <w:pPr>
+        <w:rPr>
+          <w:rFonts w:eastAsiaTheme="minorEastAsia"/>
+        </w:rPr>
+      </w:pPr>
+    </w:p>
+    <w:p>
+      <w:pPr>
+        <w:rPr>
+          <w:rFonts w:eastAsiaTheme="minorEastAsia"/>
+          <w:u w:val="single"/>
+        </w:rPr>
+      </w:pPr>
+      <w:r>
+        <w:rPr>
+          <w:rFonts w:eastAsiaTheme="minorEastAsia"/>
+          <w:u w:val="single"/>
+        </w:rPr>
+        <w:lastRenderedPageBreak/>
+        <w:t>Data and Code Availability</w:t>
+      </w:r>
+    </w:p>
+    <w:p>
+      <w:pPr>
+        <w:rPr>
+          <w:rFonts w:eastAsiaTheme="minorEastAsia"/>
+        </w:rPr>
+      </w:pPr>
+      <w:r>
+        <w:rPr>
+          <w:rFonts w:eastAsiaTheme="minorEastAsia"/>
+        </w:rPr>
+        <w:t>All the code used to simulate the scattering curves and to fit the data can be found at:</w:t>
+      </w:r>
+      <w:r>
+        <w:t xml:space="preserve"> </w:t>
+      </w:r>
+      <w:hyperlink r:id="rId7" w:history="1">
+        <w:r>
+          <w:rPr>
+            <w:rStyle w:val="Hyperlink"/>
+            <w:rFonts w:eastAsiaTheme="minorEastAsia"/>
+          </w:rPr>
+          <w:t>https://github.com/pozzo-research-group/MC-DFM/tree/main/Notebooks</w:t>
+        </w:r>
+      </w:hyperlink>
     </w:p>
     <w:p>
       <w:pPr>
@@ -2092,6 +2468,18 @@
       <w:shd w:val="clear" w:color="auto" w:fill="E1DFDD"/>
     </w:rPr>
   </w:style>
+  <w:style w:type="character" w:styleId="FollowedHyperlink">
+    <w:name w:val="FollowedHyperlink"/>
+    <w:basedOn w:val="DefaultParagraphFont"/>
+    <w:uiPriority w:val="99"/>
+    <w:semiHidden/>
+    <w:unhideWhenUsed/>
+    <w:rsid w:val="00ED63EA"/>
+    <w:rPr>
+      <w:color w:val="96607D" w:themeColor="followedHyperlink"/>
+      <w:u w:val="single"/>
+    </w:rPr>
+  </w:style>
 </w:styles>
 </file>
 

</xml_diff>